<commit_message>
fix(BAKL): cell padding on Petugas Lapangan table
Data-row text sat flush against the left border. Root cause: each cell had
its own tcMar with left/right=0 overriding the (absent) table margin. Add
table-level tblCellMar (144 twips, inserted before tblLook per schema order
or LibreOffice ignores it) and bump every cell's tcMar left/right to 144.

Co-Authored-By: Claude Opus 4.8 <noreply@anthropic.com>
</commit_message>
<xml_diff>
--- a/templates/docx/BAKL.docx
+++ b/templates/docx/BAKL.docx
@@ -1797,6 +1797,12 @@
           <w:insideV w:color="000000" w:space="0" w:sz="8" w:val="single"/>
         </w:tblBorders>
         <w:tblLayout w:type="fixed"/>
+        <w:tblCellMar>
+          <w:top w:w="15" w:type="dxa"/>
+          <w:left w:w="144" w:type="dxa"/>
+          <w:bottom w:w="15" w:type="dxa"/>
+          <w:right w:w="144" w:type="dxa"/>
+        </w:tblCellMar>
         <w:tblLook w:val="0600"/>
       </w:tblPr>
       <w:tblGrid>
@@ -1825,9 +1831,9 @@
             <w:shd w:fill="auto" w:val="clear"/>
             <w:tcMar>
               <w:top w:w="0.0" w:type="dxa"/>
-              <w:left w:w="0.0" w:type="dxa"/>
+              <w:left w:w="144" w:type="dxa"/>
               <w:bottom w:w="0.0" w:type="dxa"/>
-              <w:right w:w="0.0" w:type="dxa"/>
+              <w:right w:w="144" w:type="dxa"/>
             </w:tcMar>
             <w:vAlign w:val="top"/>
           </w:tcPr>
@@ -1866,9 +1872,9 @@
             <w:shd w:fill="auto" w:val="clear"/>
             <w:tcMar>
               <w:top w:w="0.0" w:type="dxa"/>
-              <w:left w:w="0.0" w:type="dxa"/>
+              <w:left w:w="144" w:type="dxa"/>
               <w:bottom w:w="0.0" w:type="dxa"/>
-              <w:right w:w="0.0" w:type="dxa"/>
+              <w:right w:w="144" w:type="dxa"/>
             </w:tcMar>
             <w:vAlign w:val="top"/>
           </w:tcPr>
@@ -1907,9 +1913,9 @@
             <w:shd w:fill="auto" w:val="clear"/>
             <w:tcMar>
               <w:top w:w="0.0" w:type="dxa"/>
-              <w:left w:w="0.0" w:type="dxa"/>
+              <w:left w:w="144" w:type="dxa"/>
               <w:bottom w:w="0.0" w:type="dxa"/>
-              <w:right w:w="0.0" w:type="dxa"/>
+              <w:right w:w="144" w:type="dxa"/>
             </w:tcMar>
             <w:vAlign w:val="top"/>
           </w:tcPr>
@@ -1948,9 +1954,9 @@
             <w:shd w:fill="auto" w:val="clear"/>
             <w:tcMar>
               <w:top w:w="0.0" w:type="dxa"/>
-              <w:left w:w="0.0" w:type="dxa"/>
+              <w:left w:w="144" w:type="dxa"/>
               <w:bottom w:w="0.0" w:type="dxa"/>
-              <w:right w:w="0.0" w:type="dxa"/>
+              <w:right w:w="144" w:type="dxa"/>
             </w:tcMar>
             <w:vAlign w:val="top"/>
           </w:tcPr>
@@ -1989,9 +1995,9 @@
             <w:shd w:fill="auto" w:val="clear"/>
             <w:tcMar>
               <w:top w:w="0.0" w:type="dxa"/>
-              <w:left w:w="0.0" w:type="dxa"/>
+              <w:left w:w="144" w:type="dxa"/>
               <w:bottom w:w="0.0" w:type="dxa"/>
-              <w:right w:w="0.0" w:type="dxa"/>
+              <w:right w:w="144" w:type="dxa"/>
             </w:tcMar>
             <w:vAlign w:val="top"/>
           </w:tcPr>
@@ -2036,9 +2042,9 @@
             <w:shd w:fill="auto" w:val="clear"/>
             <w:tcMar>
               <w:top w:w="0.0" w:type="dxa"/>
-              <w:left w:w="0.0" w:type="dxa"/>
+              <w:left w:w="144" w:type="dxa"/>
               <w:bottom w:w="0.0" w:type="dxa"/>
-              <w:right w:w="0.0" w:type="dxa"/>
+              <w:right w:w="144" w:type="dxa"/>
             </w:tcMar>
             <w:vAlign w:val="top"/>
           </w:tcPr>
@@ -2053,9 +2059,9 @@
             <w:shd w:fill="auto" w:val="clear"/>
             <w:tcMar>
               <w:top w:w="0.0" w:type="dxa"/>
-              <w:left w:w="0.0" w:type="dxa"/>
+              <w:left w:w="144" w:type="dxa"/>
               <w:bottom w:w="0.0" w:type="dxa"/>
-              <w:right w:w="0.0" w:type="dxa"/>
+              <w:right w:w="144" w:type="dxa"/>
             </w:tcMar>
             <w:vAlign w:val="top"/>
           </w:tcPr>
@@ -2070,9 +2076,9 @@
             <w:shd w:fill="auto" w:val="clear"/>
             <w:tcMar>
               <w:top w:w="0.0" w:type="dxa"/>
-              <w:left w:w="0.0" w:type="dxa"/>
+              <w:left w:w="144" w:type="dxa"/>
               <w:bottom w:w="0.0" w:type="dxa"/>
-              <w:right w:w="0.0" w:type="dxa"/>
+              <w:right w:w="144" w:type="dxa"/>
             </w:tcMar>
             <w:vAlign w:val="top"/>
           </w:tcPr>
@@ -2087,9 +2093,9 @@
             <w:shd w:fill="auto" w:val="clear"/>
             <w:tcMar>
               <w:top w:w="0.0" w:type="dxa"/>
-              <w:left w:w="0.0" w:type="dxa"/>
+              <w:left w:w="144" w:type="dxa"/>
               <w:bottom w:w="0.0" w:type="dxa"/>
-              <w:right w:w="0.0" w:type="dxa"/>
+              <w:right w:w="144" w:type="dxa"/>
             </w:tcMar>
             <w:vAlign w:val="top"/>
           </w:tcPr>
@@ -2104,9 +2110,9 @@
             <w:shd w:fill="auto" w:val="clear"/>
             <w:tcMar>
               <w:top w:w="0.0" w:type="dxa"/>
-              <w:left w:w="0.0" w:type="dxa"/>
+              <w:left w:w="144" w:type="dxa"/>
               <w:bottom w:w="0.0" w:type="dxa"/>
-              <w:right w:w="0.0" w:type="dxa"/>
+              <w:right w:w="144" w:type="dxa"/>
             </w:tcMar>
             <w:vAlign w:val="top"/>
           </w:tcPr>

</xml_diff>